<commit_message>
Accept the leftover tracked deletion in the Geodezia privacy policy.
The word "тестовый" stayed in the file as a revision and showed up in PDF export. The deletion is now applied, and the rest of the document is unchanged.

Co-authored-by: childfocus.ai <childfocus.ai@gmail.com>
</commit_message>
<xml_diff>
--- a/папка геодезия/Политика_конфиденциальности_на_сайт_Geodezia_Ostapenko_2.docx
+++ b/папка геодезия/Политика_конфиденциальности_на_сайт_Geodezia_Ostapenko_2.docx
@@ -907,14 +907,6 @@
         </w:rPr>
         <w:t xml:space="preserve">получить дополнительную информацию или </w:t>
       </w:r>
-      <w:del w:id="0" w:author="Ivan Zaletaev" w:date="2026-09-24T10:50:00Z">
-        <w:r>
-          <w:rPr>
-            <w:rFonts w:ascii="Times New Roman" w:hAnsi="Times New Roman" w:cs="Times New Roman"/>
-          </w:rPr>
-          <w:delText xml:space="preserve">тестовый </w:delText>
-        </w:r>
-      </w:del>
       <w:r>
         <w:rPr>
           <w:rFonts w:ascii="Times New Roman" w:hAnsi="Times New Roman" w:cs="Times New Roman"/>

</xml_diff>